<commit_message>
added ice gauntlets and added more stuff
</commit_message>
<xml_diff>
--- a/World of Spirits.docx
+++ b/World of Spirits.docx
@@ -816,6 +816,7 @@
           <w:b/>
           <w:bCs/>
         </w:rPr>
+        <w:lastRenderedPageBreak/>
         <w:t>A powerful corruption known as The Void began consuming spirits and twisting them into dangerous creatures known as the Elemental Kin.</w:t>
       </w:r>
     </w:p>
@@ -1260,6 +1261,7 @@
           <w:b/>
           <w:bCs/>
         </w:rPr>
+        <w:lastRenderedPageBreak/>
         <w:pict w14:anchorId="7533A225">
           <v:rect id="_x0000_i1030" style="width:0;height:1.5pt" o:hralign="center" o:hrstd="t" o:hr="t" fillcolor="#a0a0a0" stroked="f"/>
         </w:pict>
@@ -1605,6 +1607,7 @@
           <w:lang w:eastAsia="en-MT"/>
           <w14:ligatures w14:val="none"/>
         </w:rPr>
+        <w:lastRenderedPageBreak/>
         <w:t>Upgrades</w:t>
       </w:r>
     </w:p>
@@ -2447,9 +2450,11 @@
       <w:r>
         <w:t xml:space="preserve">Ability </w:t>
       </w:r>
+      <w:proofErr w:type="gramStart"/>
       <w:r>
         <w:t>4:RockFall</w:t>
       </w:r>
+      <w:proofErr w:type="gramEnd"/>
     </w:p>
     <w:p>
       <w:pPr>
@@ -2516,6 +2521,7 @@
           <w:b/>
           <w:bCs/>
         </w:rPr>
+        <w:lastRenderedPageBreak/>
         <w:t xml:space="preserve">Larger spikes </w:t>
       </w:r>
     </w:p>
@@ -3036,6 +3042,7 @@
           <w:lang w:eastAsia="en-MT"/>
           <w14:ligatures w14:val="none"/>
         </w:rPr>
+        <w:lastRenderedPageBreak/>
         <w:t>Lv3</w:t>
       </w:r>
       <w:r>
@@ -3551,6 +3558,7 @@
           <w:lang w:eastAsia="en-MT"/>
           <w14:ligatures w14:val="none"/>
         </w:rPr>
+        <w:lastRenderedPageBreak/>
         <w:t>Lv2</w:t>
       </w:r>
       <w:r>
@@ -4015,6 +4023,198 @@
     </w:p>
     <w:p>
       <w:pPr>
+        <w:pStyle w:val="Heading4"/>
+      </w:pPr>
+      <w:r>
+        <w:t xml:space="preserve">Description </w:t>
+      </w:r>
+    </w:p>
+    <w:p>
+      <w:pPr>
+        <w:rPr>
+          <w:b/>
+          <w:bCs/>
+        </w:rPr>
+      </w:pPr>
+      <w:r>
+        <w:rPr>
+          <w:b/>
+          <w:bCs/>
+        </w:rPr>
+        <w:t xml:space="preserve">summons two </w:t>
+      </w:r>
+      <w:proofErr w:type="spellStart"/>
+      <w:r>
+        <w:rPr>
+          <w:b/>
+          <w:bCs/>
+        </w:rPr>
+        <w:t>i</w:t>
+      </w:r>
+      <w:proofErr w:type="spellEnd"/>
+      <w:r>
+        <w:rPr>
+          <w:b/>
+          <w:bCs/>
+        </w:rPr>
+        <w:t xml:space="preserve"> </w:t>
+      </w:r>
+      <w:proofErr w:type="spellStart"/>
+      <w:r>
+        <w:rPr>
+          <w:b/>
+          <w:bCs/>
+        </w:rPr>
+        <w:t>guantlits</w:t>
+      </w:r>
+      <w:proofErr w:type="spellEnd"/>
+      <w:r>
+        <w:rPr>
+          <w:b/>
+          <w:bCs/>
+        </w:rPr>
+        <w:t xml:space="preserve"> that punch the nearest enemy</w:t>
+      </w:r>
+    </w:p>
+    <w:p>
+      <w:pPr>
+        <w:pStyle w:val="Heading4"/>
+        <w:rPr>
+          <w:lang w:eastAsia="en-MT"/>
+        </w:rPr>
+      </w:pPr>
+      <w:r>
+        <w:rPr>
+          <w:lang w:eastAsia="en-MT"/>
+        </w:rPr>
+        <w:t>Upgrades</w:t>
+      </w:r>
+    </w:p>
+    <w:p>
+      <w:pPr>
+        <w:ind w:firstLine="720"/>
+        <w:rPr>
+          <w:lang w:eastAsia="en-MT"/>
+        </w:rPr>
+      </w:pPr>
+      <w:r>
+        <w:rPr>
+          <w:lang w:eastAsia="en-MT"/>
+        </w:rPr>
+        <w:t xml:space="preserve">Lvl1 </w:t>
+      </w:r>
+      <w:proofErr w:type="spellStart"/>
+      <w:r>
+        <w:rPr>
+          <w:lang w:eastAsia="en-MT"/>
+        </w:rPr>
+        <w:t>sumons</w:t>
+      </w:r>
+      <w:proofErr w:type="spellEnd"/>
+      <w:r>
+        <w:rPr>
+          <w:lang w:eastAsia="en-MT"/>
+        </w:rPr>
+        <w:t xml:space="preserve"> a single fist</w:t>
+      </w:r>
+    </w:p>
+    <w:p>
+      <w:pPr>
+        <w:ind w:firstLine="720"/>
+        <w:rPr>
+          <w:lang w:eastAsia="en-MT"/>
+        </w:rPr>
+      </w:pPr>
+      <w:r>
+        <w:rPr>
+          <w:lang w:eastAsia="en-MT"/>
+        </w:rPr>
+        <w:t xml:space="preserve">Lvl2 </w:t>
+      </w:r>
+      <w:proofErr w:type="spellStart"/>
+      <w:r>
+        <w:rPr>
+          <w:lang w:eastAsia="en-MT"/>
+        </w:rPr>
+        <w:t>increas</w:t>
+      </w:r>
+      <w:proofErr w:type="spellEnd"/>
+      <w:r>
+        <w:rPr>
+          <w:lang w:eastAsia="en-MT"/>
+        </w:rPr>
+        <w:t xml:space="preserve"> the knock back and chance to </w:t>
+      </w:r>
+      <w:proofErr w:type="spellStart"/>
+      <w:r>
+        <w:rPr>
+          <w:lang w:eastAsia="en-MT"/>
+        </w:rPr>
+        <w:t>freez</w:t>
+      </w:r>
+      <w:proofErr w:type="spellEnd"/>
+    </w:p>
+    <w:p>
+      <w:pPr>
+        <w:ind w:firstLine="720"/>
+        <w:rPr>
+          <w:lang w:eastAsia="en-MT"/>
+        </w:rPr>
+      </w:pPr>
+      <w:r>
+        <w:rPr>
+          <w:lang w:eastAsia="en-MT"/>
+        </w:rPr>
+        <w:t xml:space="preserve">Lvl3sumons 2 fists now </w:t>
+      </w:r>
+    </w:p>
+    <w:p>
+      <w:pPr>
+        <w:ind w:firstLine="720"/>
+        <w:rPr>
+          <w:lang w:eastAsia="en-MT"/>
+        </w:rPr>
+      </w:pPr>
+      <w:r>
+        <w:rPr>
+          <w:lang w:eastAsia="en-MT"/>
+        </w:rPr>
+        <w:lastRenderedPageBreak/>
+        <w:t xml:space="preserve">Lvl4 </w:t>
+      </w:r>
+      <w:proofErr w:type="spellStart"/>
+      <w:r>
+        <w:rPr>
+          <w:lang w:eastAsia="en-MT"/>
+        </w:rPr>
+        <w:t>increas</w:t>
+      </w:r>
+      <w:proofErr w:type="spellEnd"/>
+      <w:r>
+        <w:rPr>
+          <w:lang w:eastAsia="en-MT"/>
+        </w:rPr>
+        <w:t xml:space="preserve"> there </w:t>
+      </w:r>
+      <w:proofErr w:type="spellStart"/>
+      <w:r>
+        <w:rPr>
+          <w:lang w:eastAsia="en-MT"/>
+        </w:rPr>
+        <w:t>dameg</w:t>
+      </w:r>
+      <w:proofErr w:type="spellEnd"/>
+    </w:p>
+    <w:p>
+      <w:pPr>
+        <w:rPr>
+          <w:b/>
+          <w:bCs/>
+        </w:rPr>
+      </w:pPr>
+    </w:p>
+    <w:p>
+      <w:pPr>
         <w:rPr>
           <w:b/>
           <w:bCs/>
@@ -4634,6 +4834,7 @@
           <w:lang w:eastAsia="en-MT"/>
           <w14:ligatures w14:val="none"/>
         </w:rPr>
+        <w:lastRenderedPageBreak/>
         <w:t>Lv1</w:t>
       </w:r>
       <w:r>
@@ -5172,6 +5373,7 @@
         <w:rPr>
           <w:lang w:eastAsia="en-MT"/>
         </w:rPr>
+        <w:lastRenderedPageBreak/>
         <w:t>Upgrades</w:t>
       </w:r>
     </w:p>
@@ -5839,6 +6041,7 @@
         <w:rPr>
           <w:lang w:eastAsia="en-MT"/>
         </w:rPr>
+        <w:lastRenderedPageBreak/>
         <w:t>Upgrades</w:t>
       </w:r>
     </w:p>
@@ -6497,6 +6700,7 @@
         <w:pStyle w:val="Heading2"/>
       </w:pPr>
       <w:r>
+        <w:lastRenderedPageBreak/>
         <w:t>Necrotic Spirit</w:t>
       </w:r>
     </w:p>
@@ -6747,6 +6951,7 @@
         <w:pStyle w:val="Heading2"/>
       </w:pPr>
       <w:r>
+        <w:lastRenderedPageBreak/>
         <w:t>Combat System</w:t>
       </w:r>
     </w:p>
@@ -6933,6 +7138,7 @@
           <w:b/>
           <w:bCs/>
         </w:rPr>
+        <w:lastRenderedPageBreak/>
         <w:t>Critical Damage</w:t>
       </w:r>
     </w:p>
@@ -7172,6 +7378,7 @@
     </w:p>
     <w:p>
       <w:r>
+        <w:lastRenderedPageBreak/>
         <w:t xml:space="preserve">Feather Barrage </w:t>
       </w:r>
     </w:p>
@@ -10651,7 +10858,7 @@
   <w:style w:type="paragraph" w:default="1" w:styleId="Normal">
     <w:name w:val="Normal"/>
     <w:qFormat/>
-    <w:rsid w:val="0011496C"/>
+    <w:rsid w:val="00576BEB"/>
   </w:style>
   <w:style w:type="paragraph" w:styleId="Heading1">
     <w:name w:val="heading 1"/>

</xml_diff>